<commit_message>
Fix formatting issues and update descriptions in IronGrind documentation for clarity and consistency
</commit_message>
<xml_diff>
--- a/Documentations/IronGrind_Chapter_One_Final.docx
+++ b/Documentations/IronGrind_Chapter_One_Final.docx
@@ -51,16 +51,16 @@
         <w:jc w:val="both"/>
       </w:pPr>
       <w:r>
-        <w:t>Iron Grind Fitness Gym is located in Purok Mangga, Sulangon, Dapitan City, Zamboanga del Norte. It serves people with different fitness goals and offers membership plans, fitness-related guidance, supplements, and gym merchandise. Its operations require the gym owner and staff to maintain accurate information about members, applications, membership periods, attendance, products, and sales.</w:t>
-      </w:r>
-    </w:p>
-    <w:p>
-      <w:pPr>
-        <w:ind w:firstLine="720"/>
-        <w:jc w:val="both"/>
-      </w:pPr>
-      <w:r>
-        <w:t>To support these activities, the proponents developed IronGrind: A Web-Based Gym Membership and Operations Management System. The system provides a common sign-in page, an online membership registration page, an admin dashboard, and a member dashboard. New applicants can submit their information online, while an administrator reviews each application and approves or rejects it. Members can view their membership status, membership-period progress, attendance history, and QR code, and can submit a renewal request when eligible.</w:t>
+        <w:t>Iron Grind Fitness Gym is located in Purok Mangga, Sulongon, Dapitan City, Zamboanga del Norte. It serves people with different fitness goals and offers membership plans, fitness-related guidance, supplements, and gym merchandise. Its operations require the gym owner and staff to maintain accurate information about members, applications, membership periods, attendance, products, and sales.</w:t>
+      </w:r>
+    </w:p>
+    <w:p>
+      <w:pPr>
+        <w:ind w:firstLine="720"/>
+        <w:jc w:val="both"/>
+      </w:pPr>
+      <w:r>
+        <w:t>To support these activities, the proponents developed IronGrind: A Web-Based Fitness Gym Membership and Operations Management System. The system provides a common sign-in page, an online membership registration page, an admin dashboard, and a member dashboard. New applicants can submit their information online, while an administrator reviews each application and approves or rejects it. Members can view their membership status, membership-period progress, attendance history, and QR code, and can submit a renewal request at any time for administrator review.</w:t>
       </w:r>
     </w:p>
     <w:p>
@@ -235,7 +235,7 @@
         <w:jc w:val="both"/>
       </w:pPr>
       <w:r>
-        <w:t>2. Develop online registration and renewal request features that allow the admin to review, approve, or reject applications, with renewal requests accepted during the configured five-day eligibility period before expiry.</w:t>
+        <w:t>2. Develop online registration and renewal request features that allow the admin to review, approve, or reject applications, Members may submit renewal requests at any time for administrator review.</w:t>
       </w:r>
     </w:p>
     <w:p>
@@ -296,7 +296,7 @@
         <w:jc w:val="both"/>
       </w:pPr>
       <w:r>
-        <w:t>The registration feature collects applicant and membership information and submits an application for admin review. The admin can manage member records and review pending applications. The member dashboard displays membership status and time-based progress, QR code, attendance history, account settings, and the renewal request feature. Renewal requests are subject to the configured eligibility period before membership expiry and require admin approval.</w:t>
+        <w:t>The registration feature collects applicant and membership information and submits an application for admin review. The admin can manage member records and review pending applications. The member dashboard displays membership status and time-based progress, QR code, attendance history, account settings, and the renewal request feature. Renewal requests may be submitted at any time and require admin approval. A request does not change the membership until approved. Approval extends an active membership from its current expiry to preserve unused days; if the membership has expired, the new period starts on the approval date.</w:t>
       </w:r>
     </w:p>
     <w:p>

</xml_diff>

<commit_message>
Update membership renewal request process to allow submissions at any time for admin review and clarify approval effects on membership status
</commit_message>
<xml_diff>
--- a/Documentations/IronGrind_Chapter_One_Final.docx
+++ b/Documentations/IronGrind_Chapter_One_Final.docx
@@ -136,7 +136,7 @@
         <w:jc w:val="both"/>
       </w:pPr>
       <w:r>
-        <w:t>2. How can members view their membership information, progress, attendance history, and QR code, and submit renewal requests when eligible?</w:t>
+        <w:t>2. How can members view their membership information, progress, attendance history, and QR code, and submit renewal requests at any time for admin review?</w:t>
       </w:r>
     </w:p>
     <w:p>
@@ -235,7 +235,7 @@
         <w:jc w:val="both"/>
       </w:pPr>
       <w:r>
-        <w:t>2. Develop online registration and renewal request features that allow the admin to review, approve, or reject applications, Members may submit renewal requests at any time for administrator review.</w:t>
+        <w:t>2. Develop online registration and renewal request features that allow the admin to review, approve, or reject applications. Members may submit renewal requests at any time, and each request requires admin approval. Approval extends an active membership from its current expiry to preserve unused days; if the membership has expired, the new period starts on the approval date.</w:t>
       </w:r>
     </w:p>
     <w:p>
@@ -386,7 +386,7 @@
         <w:jc w:val="both"/>
       </w:pPr>
       <w:r>
-        <w:t>Members can access their membership information, time-based membership progress, QR code, and attendance history through the member dashboard. They can also submit renewal requests online when eligible and update supported personal information.</w:t>
+        <w:t>Members can access their membership information, time-based membership progress, QR code, and attendance history through the member dashboard. They can also submit renewal requests online at any time for admin review and update supported personal information.</w:t>
       </w:r>
     </w:p>
     <w:p>
@@ -555,7 +555,7 @@
         <w:jc w:val="both"/>
       </w:pPr>
       <w:r>
-        <w:t>Membership Renewal Request. A request submitted by an existing member asking the admin to renew the membership, subject to the system’s eligibility rules and admin approval.</w:t>
+        <w:t>Membership Renewal Request. A request submitted by an existing member asking the admin to renew the membership. It may be submitted at any time and takes effect only after admin approval. An active membership is extended from its current expiry; an expired membership restarts on the approval date.</w:t>
       </w:r>
     </w:p>
     <w:p>

</xml_diff>